<commit_message>
design: agregados diagramas de clases y casos de uso UML
</commit_message>
<xml_diff>
--- a/TEST/ACT#1DSI.docx
+++ b/TEST/ACT#1DSI.docx
@@ -4,6 +4,9 @@
   <w:body>
     <w:p>
       <w:r>
+        <w:rPr>
+          <w:noProof/>
+        </w:rPr>
         <w:drawing>
           <wp:inline distT="0" distB="0" distL="0" distR="0" wp14:anchorId="496F1DF3" wp14:editId="46DCC71F">
             <wp:extent cx="4182059" cy="2467319"/>
@@ -29,6 +32,242 @@
                     <a:xfrm>
                       <a:off x="0" y="0"/>
                       <a:ext cx="4182059" cy="2467319"/>
+                    </a:xfrm>
+                    <a:prstGeom prst="rect">
+                      <a:avLst/>
+                    </a:prstGeom>
+                  </pic:spPr>
+                </pic:pic>
+              </a:graphicData>
+            </a:graphic>
+          </wp:inline>
+        </w:drawing>
+      </w:r>
+    </w:p>
+    <w:p/>
+    <w:p>
+      <w:r>
+        <w:drawing>
+          <wp:inline distT="0" distB="0" distL="0" distR="0" wp14:anchorId="7FFF68AE" wp14:editId="145456FB">
+            <wp:extent cx="5400040" cy="3095625"/>
+            <wp:effectExtent l="0" t="0" r="0" b="9525"/>
+            <wp:docPr id="505583510" name="Imagen 1"/>
+            <wp:cNvGraphicFramePr>
+              <a:graphicFrameLocks xmlns:a="http://schemas.openxmlformats.org/drawingml/2006/main" noChangeAspect="1"/>
+            </wp:cNvGraphicFramePr>
+            <a:graphic xmlns:a="http://schemas.openxmlformats.org/drawingml/2006/main">
+              <a:graphicData uri="http://schemas.openxmlformats.org/drawingml/2006/picture">
+                <pic:pic xmlns:pic="http://schemas.openxmlformats.org/drawingml/2006/picture">
+                  <pic:nvPicPr>
+                    <pic:cNvPr id="505583510" name=""/>
+                    <pic:cNvPicPr/>
+                  </pic:nvPicPr>
+                  <pic:blipFill>
+                    <a:blip r:embed="rId5"/>
+                    <a:stretch>
+                      <a:fillRect/>
+                    </a:stretch>
+                  </pic:blipFill>
+                  <pic:spPr>
+                    <a:xfrm>
+                      <a:off x="0" y="0"/>
+                      <a:ext cx="5400040" cy="3095625"/>
+                    </a:xfrm>
+                    <a:prstGeom prst="rect">
+                      <a:avLst/>
+                    </a:prstGeom>
+                  </pic:spPr>
+                </pic:pic>
+              </a:graphicData>
+            </a:graphic>
+          </wp:inline>
+        </w:drawing>
+      </w:r>
+    </w:p>
+    <w:p>
+      <w:r>
+        <w:lastRenderedPageBreak/>
+        <w:drawing>
+          <wp:inline distT="0" distB="0" distL="0" distR="0" wp14:anchorId="3C903AF8" wp14:editId="358D233E">
+            <wp:extent cx="5400040" cy="4435475"/>
+            <wp:effectExtent l="0" t="0" r="0" b="3175"/>
+            <wp:docPr id="1626452384" name="Imagen 1"/>
+            <wp:cNvGraphicFramePr>
+              <a:graphicFrameLocks xmlns:a="http://schemas.openxmlformats.org/drawingml/2006/main" noChangeAspect="1"/>
+            </wp:cNvGraphicFramePr>
+            <a:graphic xmlns:a="http://schemas.openxmlformats.org/drawingml/2006/main">
+              <a:graphicData uri="http://schemas.openxmlformats.org/drawingml/2006/picture">
+                <pic:pic xmlns:pic="http://schemas.openxmlformats.org/drawingml/2006/picture">
+                  <pic:nvPicPr>
+                    <pic:cNvPr id="1626452384" name=""/>
+                    <pic:cNvPicPr/>
+                  </pic:nvPicPr>
+                  <pic:blipFill>
+                    <a:blip r:embed="rId6"/>
+                    <a:stretch>
+                      <a:fillRect/>
+                    </a:stretch>
+                  </pic:blipFill>
+                  <pic:spPr>
+                    <a:xfrm>
+                      <a:off x="0" y="0"/>
+                      <a:ext cx="5400040" cy="4435475"/>
+                    </a:xfrm>
+                    <a:prstGeom prst="rect">
+                      <a:avLst/>
+                    </a:prstGeom>
+                  </pic:spPr>
+                </pic:pic>
+              </a:graphicData>
+            </a:graphic>
+          </wp:inline>
+        </w:drawing>
+      </w:r>
+    </w:p>
+    <w:p/>
+    <w:p/>
+    <w:p/>
+    <w:p>
+      <w:r>
+        <w:lastRenderedPageBreak/>
+        <w:drawing>
+          <wp:inline distT="0" distB="0" distL="0" distR="0" wp14:anchorId="1CDEE563" wp14:editId="35ADAB2F">
+            <wp:extent cx="5400040" cy="1368425"/>
+            <wp:effectExtent l="0" t="0" r="0" b="3175"/>
+            <wp:docPr id="1912763781" name="Imagen 1"/>
+            <wp:cNvGraphicFramePr>
+              <a:graphicFrameLocks xmlns:a="http://schemas.openxmlformats.org/drawingml/2006/main" noChangeAspect="1"/>
+            </wp:cNvGraphicFramePr>
+            <a:graphic xmlns:a="http://schemas.openxmlformats.org/drawingml/2006/main">
+              <a:graphicData uri="http://schemas.openxmlformats.org/drawingml/2006/picture">
+                <pic:pic xmlns:pic="http://schemas.openxmlformats.org/drawingml/2006/picture">
+                  <pic:nvPicPr>
+                    <pic:cNvPr id="1912763781" name=""/>
+                    <pic:cNvPicPr/>
+                  </pic:nvPicPr>
+                  <pic:blipFill>
+                    <a:blip r:embed="rId7"/>
+                    <a:stretch>
+                      <a:fillRect/>
+                    </a:stretch>
+                  </pic:blipFill>
+                  <pic:spPr>
+                    <a:xfrm>
+                      <a:off x="0" y="0"/>
+                      <a:ext cx="5400040" cy="1368425"/>
+                    </a:xfrm>
+                    <a:prstGeom prst="rect">
+                      <a:avLst/>
+                    </a:prstGeom>
+                  </pic:spPr>
+                </pic:pic>
+              </a:graphicData>
+            </a:graphic>
+          </wp:inline>
+        </w:drawing>
+      </w:r>
+      <w:r>
+        <w:drawing>
+          <wp:inline distT="0" distB="0" distL="0" distR="0" wp14:anchorId="6A60C27C" wp14:editId="7ADA1687">
+            <wp:extent cx="5400040" cy="1370330"/>
+            <wp:effectExtent l="0" t="0" r="0" b="1270"/>
+            <wp:docPr id="246891440" name="Imagen 1"/>
+            <wp:cNvGraphicFramePr>
+              <a:graphicFrameLocks xmlns:a="http://schemas.openxmlformats.org/drawingml/2006/main" noChangeAspect="1"/>
+            </wp:cNvGraphicFramePr>
+            <a:graphic xmlns:a="http://schemas.openxmlformats.org/drawingml/2006/main">
+              <a:graphicData uri="http://schemas.openxmlformats.org/drawingml/2006/picture">
+                <pic:pic xmlns:pic="http://schemas.openxmlformats.org/drawingml/2006/picture">
+                  <pic:nvPicPr>
+                    <pic:cNvPr id="246891440" name=""/>
+                    <pic:cNvPicPr/>
+                  </pic:nvPicPr>
+                  <pic:blipFill>
+                    <a:blip r:embed="rId8"/>
+                    <a:stretch>
+                      <a:fillRect/>
+                    </a:stretch>
+                  </pic:blipFill>
+                  <pic:spPr>
+                    <a:xfrm>
+                      <a:off x="0" y="0"/>
+                      <a:ext cx="5400040" cy="1370330"/>
+                    </a:xfrm>
+                    <a:prstGeom prst="rect">
+                      <a:avLst/>
+                    </a:prstGeom>
+                  </pic:spPr>
+                </pic:pic>
+              </a:graphicData>
+            </a:graphic>
+          </wp:inline>
+        </w:drawing>
+      </w:r>
+      <w:r>
+        <w:drawing>
+          <wp:inline distT="0" distB="0" distL="0" distR="0" wp14:anchorId="6E3D4BA7" wp14:editId="4A9D869D">
+            <wp:extent cx="5400040" cy="2107565"/>
+            <wp:effectExtent l="0" t="0" r="0" b="6985"/>
+            <wp:docPr id="253835881" name="Imagen 1"/>
+            <wp:cNvGraphicFramePr>
+              <a:graphicFrameLocks xmlns:a="http://schemas.openxmlformats.org/drawingml/2006/main" noChangeAspect="1"/>
+            </wp:cNvGraphicFramePr>
+            <a:graphic xmlns:a="http://schemas.openxmlformats.org/drawingml/2006/main">
+              <a:graphicData uri="http://schemas.openxmlformats.org/drawingml/2006/picture">
+                <pic:pic xmlns:pic="http://schemas.openxmlformats.org/drawingml/2006/picture">
+                  <pic:nvPicPr>
+                    <pic:cNvPr id="253835881" name=""/>
+                    <pic:cNvPicPr/>
+                  </pic:nvPicPr>
+                  <pic:blipFill>
+                    <a:blip r:embed="rId9"/>
+                    <a:stretch>
+                      <a:fillRect/>
+                    </a:stretch>
+                  </pic:blipFill>
+                  <pic:spPr>
+                    <a:xfrm>
+                      <a:off x="0" y="0"/>
+                      <a:ext cx="5400040" cy="2107565"/>
+                    </a:xfrm>
+                    <a:prstGeom prst="rect">
+                      <a:avLst/>
+                    </a:prstGeom>
+                  </pic:spPr>
+                </pic:pic>
+              </a:graphicData>
+            </a:graphic>
+          </wp:inline>
+        </w:drawing>
+      </w:r>
+    </w:p>
+    <w:p>
+      <w:r>
+        <w:drawing>
+          <wp:inline distT="0" distB="0" distL="0" distR="0" wp14:anchorId="65DDE2D6" wp14:editId="5059F5B9">
+            <wp:extent cx="5400040" cy="1541780"/>
+            <wp:effectExtent l="0" t="0" r="0" b="1270"/>
+            <wp:docPr id="395116268" name="Imagen 1"/>
+            <wp:cNvGraphicFramePr>
+              <a:graphicFrameLocks xmlns:a="http://schemas.openxmlformats.org/drawingml/2006/main" noChangeAspect="1"/>
+            </wp:cNvGraphicFramePr>
+            <a:graphic xmlns:a="http://schemas.openxmlformats.org/drawingml/2006/main">
+              <a:graphicData uri="http://schemas.openxmlformats.org/drawingml/2006/picture">
+                <pic:pic xmlns:pic="http://schemas.openxmlformats.org/drawingml/2006/picture">
+                  <pic:nvPicPr>
+                    <pic:cNvPr id="395116268" name=""/>
+                    <pic:cNvPicPr/>
+                  </pic:nvPicPr>
+                  <pic:blipFill>
+                    <a:blip r:embed="rId10"/>
+                    <a:stretch>
+                      <a:fillRect/>
+                    </a:stretch>
+                  </pic:blipFill>
+                  <pic:spPr>
+                    <a:xfrm>
+                      <a:off x="0" y="0"/>
+                      <a:ext cx="5400040" cy="1541780"/>
                     </a:xfrm>
                     <a:prstGeom prst="rect">
                       <a:avLst/>

</xml_diff>